<commit_message>
Supplementary materials DOCX: page break before each section
Co-Authored-By: Claude Opus 4.7 (1M context) <noreply@anthropic.com>
</commit_message>
<xml_diff>
--- a/submission/supplementary_materials.docx
+++ b/submission/supplementary_materials.docx
@@ -1651,6 +1651,11 @@
         <w:t xml:space="preserve">applies to a fresh graph and ticks without error.</w:t>
       </w:r>
     </w:p>
+    <w:p>
+      <w:r>
+        <w:br w:type="page"/>
+      </w:r>
+    </w:p>
     <w:bookmarkEnd w:id="11"/>
     <w:bookmarkEnd w:id="12"/>
     <w:bookmarkStart w:id="13" w:name="appendix-b-computational-footprint"/>
@@ -1995,6 +2000,11 @@
         </w:tc>
       </w:tr>
     </w:tbl>
+    <w:p>
+      <w:r>
+        <w:br w:type="page"/>
+      </w:r>
+    </w:p>
     <w:bookmarkEnd w:id="13"/>
     <w:bookmarkStart w:id="14" w:name="X6db17b076d205823721ef7d117d3d3e1195124d"/>
     <w:p>
@@ -2250,6 +2260,11 @@
         <w:t xml:space="preserve">for proportions use the normal (Wald) form.</w:t>
       </w:r>
     </w:p>
+    <w:p>
+      <w:r>
+        <w:br w:type="page"/>
+      </w:r>
+    </w:p>
     <w:bookmarkEnd w:id="14"/>
     <w:bookmarkStart w:id="15" w:name="appendix-d-use-of-ai-coding-assistance"/>
     <w:p>
@@ -2362,6 +2377,11 @@
       </w:r>
       <w:r>
         <w:t xml:space="preserve">manuscript.</w:t>
+      </w:r>
+    </w:p>
+    <w:p>
+      <w:r>
+        <w:br w:type="page"/>
       </w:r>
     </w:p>
     <w:bookmarkEnd w:id="15"/>
@@ -2994,6 +3014,11 @@
         </w:tc>
       </w:tr>
     </w:tbl>
+    <w:p>
+      <w:r>
+        <w:br w:type="page"/>
+      </w:r>
+    </w:p>
     <w:bookmarkEnd w:id="16"/>
     <w:bookmarkStart w:id="17" w:name="Xa0ed57b5c70a51013a2a7b93c8801e67d03119f"/>
     <w:p>
@@ -3289,6 +3314,11 @@
       </w:r>
       <w:r>
         <w:t xml:space="preserve">navigation.</w:t>
+      </w:r>
+    </w:p>
+    <w:p>
+      <w:r>
+        <w:br w:type="page"/>
       </w:r>
     </w:p>
     <w:bookmarkEnd w:id="17"/>

</xml_diff>